<commit_message>
Updated AI tender generation and document export
</commit_message>
<xml_diff>
--- a/Tender_Report.docx
+++ b/Tender_Report.docx
@@ -7,12 +7,506 @@
         <w:pStyle w:val="Heading1"/>
       </w:pPr>
       <w:r>
-        <w:t>AI Tender Report</w:t>
+        <w:t>DETAILED TENDER NOTICE</w:t>
       </w:r>
     </w:p>
     <w:p>
       <w:r>
-        <w:t>Generated by E-Procurement AI System</w:t>
+        <w:t>Technical Specification + BOQ + Approval Note</w:t>
+      </w:r>
+    </w:p>
+    <w:p>
+      <w:pPr>
+        <w:pStyle w:val="Heading2"/>
+      </w:pPr>
+      <w:r>
+        <w:t>MATERIAL PURCHASE REQUEST</w:t>
+      </w:r>
+    </w:p>
+    <w:p>
+      <w:r>
+        <w:t>MPR No: MPR/2026/05/00004</w:t>
+      </w:r>
+    </w:p>
+    <w:p>
+      <w:r>
+        <w:t>Project Name: earphone</w:t>
+      </w:r>
+    </w:p>
+    <w:tbl>
+      <w:tblPr>
+        <w:tblStyle w:val="TableGrid"/>
+        <w:tblW w:type="auto" w:w="0"/>
+        <w:tblLook w:firstColumn="1" w:firstRow="1" w:lastColumn="0" w:lastRow="0" w:noHBand="0" w:noVBand="1" w:val="04A0"/>
+      </w:tblPr>
+      <w:tblGrid>
+        <w:gridCol w:w="1234"/>
+        <w:gridCol w:w="1234"/>
+        <w:gridCol w:w="1234"/>
+        <w:gridCol w:w="1234"/>
+        <w:gridCol w:w="1234"/>
+        <w:gridCol w:w="1234"/>
+        <w:gridCol w:w="1234"/>
+      </w:tblGrid>
+      <w:tr>
+        <w:tc>
+          <w:tcPr>
+            <w:tcW w:type="dxa" w:w="1234"/>
+          </w:tcPr>
+          <w:p>
+            <w:r>
+              <w:t>Item No</w:t>
+            </w:r>
+          </w:p>
+        </w:tc>
+        <w:tc>
+          <w:tcPr>
+            <w:tcW w:type="dxa" w:w="1234"/>
+          </w:tcPr>
+          <w:p>
+            <w:r>
+              <w:t>Item Name</w:t>
+            </w:r>
+          </w:p>
+        </w:tc>
+        <w:tc>
+          <w:tcPr>
+            <w:tcW w:type="dxa" w:w="1234"/>
+          </w:tcPr>
+          <w:p>
+            <w:r>
+              <w:t>Mpr Header ID</w:t>
+            </w:r>
+          </w:p>
+        </w:tc>
+        <w:tc>
+          <w:tcPr>
+            <w:tcW w:type="dxa" w:w="1234"/>
+          </w:tcPr>
+          <w:p>
+            <w:r>
+              <w:t>Specification</w:t>
+            </w:r>
+          </w:p>
+        </w:tc>
+        <w:tc>
+          <w:tcPr>
+            <w:tcW w:type="dxa" w:w="1234"/>
+          </w:tcPr>
+          <w:p>
+            <w:r>
+              <w:t>UOM</w:t>
+            </w:r>
+          </w:p>
+        </w:tc>
+        <w:tc>
+          <w:tcPr>
+            <w:tcW w:type="dxa" w:w="1234"/>
+          </w:tcPr>
+          <w:p>
+            <w:r>
+              <w:t>Quantity</w:t>
+            </w:r>
+          </w:p>
+        </w:tc>
+        <w:tc>
+          <w:tcPr>
+            <w:tcW w:type="dxa" w:w="1234"/>
+          </w:tcPr>
+          <w:p>
+            <w:r>
+              <w:t>Estimated Rate</w:t>
+            </w:r>
+          </w:p>
+        </w:tc>
+      </w:tr>
+      <w:tr>
+        <w:tc>
+          <w:tcPr>
+            <w:tcW w:type="dxa" w:w="1234"/>
+          </w:tcPr>
+          <w:p>
+            <w:r>
+              <w:t>1</w:t>
+            </w:r>
+          </w:p>
+        </w:tc>
+        <w:tc>
+          <w:tcPr>
+            <w:tcW w:type="dxa" w:w="1234"/>
+          </w:tcPr>
+          <w:p>
+            <w:r>
+              <w:t>earphone</w:t>
+            </w:r>
+          </w:p>
+        </w:tc>
+        <w:tc>
+          <w:tcPr>
+            <w:tcW w:type="dxa" w:w="1234"/>
+          </w:tcPr>
+          <w:p>
+            <w:r/>
+          </w:p>
+        </w:tc>
+        <w:tc>
+          <w:tcPr>
+            <w:tcW w:type="dxa" w:w="1234"/>
+          </w:tcPr>
+          <w:p>
+            <w:r>
+              <w:t>wireless</w:t>
+            </w:r>
+          </w:p>
+        </w:tc>
+        <w:tc>
+          <w:tcPr>
+            <w:tcW w:type="dxa" w:w="1234"/>
+          </w:tcPr>
+          <w:p>
+            <w:r>
+              <w:t>Nos</w:t>
+            </w:r>
+          </w:p>
+        </w:tc>
+        <w:tc>
+          <w:tcPr>
+            <w:tcW w:type="dxa" w:w="1234"/>
+          </w:tcPr>
+          <w:p>
+            <w:r>
+              <w:t>20.00</w:t>
+            </w:r>
+          </w:p>
+        </w:tc>
+        <w:tc>
+          <w:tcPr>
+            <w:tcW w:type="dxa" w:w="1234"/>
+          </w:tcPr>
+          <w:p>
+            <w:r>
+              <w:t>4000.00</w:t>
+            </w:r>
+          </w:p>
+        </w:tc>
+      </w:tr>
+      <w:tr>
+        <w:tc>
+          <w:tcPr>
+            <w:tcW w:type="dxa" w:w="1234"/>
+          </w:tcPr>
+          <w:p>
+            <w:r>
+              <w:t>2</w:t>
+            </w:r>
+          </w:p>
+        </w:tc>
+        <w:tc>
+          <w:tcPr>
+            <w:tcW w:type="dxa" w:w="1234"/>
+          </w:tcPr>
+          <w:p>
+            <w:r>
+              <w:t>One Plus nord 5</w:t>
+            </w:r>
+          </w:p>
+        </w:tc>
+        <w:tc>
+          <w:tcPr>
+            <w:tcW w:type="dxa" w:w="1234"/>
+          </w:tcPr>
+          <w:p>
+            <w:r/>
+          </w:p>
+        </w:tc>
+        <w:tc>
+          <w:tcPr>
+            <w:tcW w:type="dxa" w:w="1234"/>
+          </w:tcPr>
+          <w:p>
+            <w:r>
+              <w:t>5g, 8 gb ram, 128 gb storage</w:t>
+            </w:r>
+          </w:p>
+        </w:tc>
+        <w:tc>
+          <w:tcPr>
+            <w:tcW w:type="dxa" w:w="1234"/>
+          </w:tcPr>
+          <w:p>
+            <w:r>
+              <w:t>Nos</w:t>
+            </w:r>
+          </w:p>
+        </w:tc>
+        <w:tc>
+          <w:tcPr>
+            <w:tcW w:type="dxa" w:w="1234"/>
+          </w:tcPr>
+          <w:p>
+            <w:r>
+              <w:t>20.00</w:t>
+            </w:r>
+          </w:p>
+        </w:tc>
+        <w:tc>
+          <w:tcPr>
+            <w:tcW w:type="dxa" w:w="1234"/>
+          </w:tcPr>
+          <w:p>
+            <w:r>
+              <w:t>29999.00</w:t>
+            </w:r>
+          </w:p>
+        </w:tc>
+      </w:tr>
+      <w:tr>
+        <w:tc>
+          <w:tcPr>
+            <w:tcW w:type="dxa" w:w="1234"/>
+          </w:tcPr>
+          <w:p>
+            <w:r>
+              <w:t>3</w:t>
+            </w:r>
+          </w:p>
+        </w:tc>
+        <w:tc>
+          <w:tcPr>
+            <w:tcW w:type="dxa" w:w="1234"/>
+          </w:tcPr>
+          <w:p>
+            <w:r>
+              <w:t>furnitur2</w:t>
+            </w:r>
+          </w:p>
+        </w:tc>
+        <w:tc>
+          <w:tcPr>
+            <w:tcW w:type="dxa" w:w="1234"/>
+          </w:tcPr>
+          <w:p>
+            <w:r/>
+          </w:p>
+        </w:tc>
+        <w:tc>
+          <w:tcPr>
+            <w:tcW w:type="dxa" w:w="1234"/>
+          </w:tcPr>
+          <w:p>
+            <w:r>
+              <w:t>fggg556666</w:t>
+            </w:r>
+          </w:p>
+        </w:tc>
+        <w:tc>
+          <w:tcPr>
+            <w:tcW w:type="dxa" w:w="1234"/>
+          </w:tcPr>
+          <w:p>
+            <w:r>
+              <w:t>Nos</w:t>
+            </w:r>
+          </w:p>
+        </w:tc>
+        <w:tc>
+          <w:tcPr>
+            <w:tcW w:type="dxa" w:w="1234"/>
+          </w:tcPr>
+          <w:p>
+            <w:r>
+              <w:t>2.00</w:t>
+            </w:r>
+          </w:p>
+        </w:tc>
+        <w:tc>
+          <w:tcPr>
+            <w:tcW w:type="dxa" w:w="1234"/>
+          </w:tcPr>
+          <w:p>
+            <w:r>
+              <w:t>100000.00</w:t>
+            </w:r>
+          </w:p>
+        </w:tc>
+      </w:tr>
+      <w:tr>
+        <w:tc>
+          <w:tcPr>
+            <w:tcW w:type="dxa" w:w="1234"/>
+          </w:tcPr>
+          <w:p>
+            <w:r>
+              <w:t>4</w:t>
+            </w:r>
+          </w:p>
+        </w:tc>
+        <w:tc>
+          <w:tcPr>
+            <w:tcW w:type="dxa" w:w="1234"/>
+          </w:tcPr>
+          <w:p>
+            <w:r>
+              <w:t>furniture</w:t>
+            </w:r>
+          </w:p>
+        </w:tc>
+        <w:tc>
+          <w:tcPr>
+            <w:tcW w:type="dxa" w:w="1234"/>
+          </w:tcPr>
+          <w:p>
+            <w:r/>
+          </w:p>
+        </w:tc>
+        <w:tc>
+          <w:tcPr>
+            <w:tcW w:type="dxa" w:w="1234"/>
+          </w:tcPr>
+          <w:p>
+            <w:r>
+              <w:t>dff4555</w:t>
+            </w:r>
+          </w:p>
+        </w:tc>
+        <w:tc>
+          <w:tcPr>
+            <w:tcW w:type="dxa" w:w="1234"/>
+          </w:tcPr>
+          <w:p>
+            <w:r>
+              <w:t>Nos</w:t>
+            </w:r>
+          </w:p>
+        </w:tc>
+        <w:tc>
+          <w:tcPr>
+            <w:tcW w:type="dxa" w:w="1234"/>
+          </w:tcPr>
+          <w:p>
+            <w:r>
+              <w:t>3.00</w:t>
+            </w:r>
+          </w:p>
+        </w:tc>
+        <w:tc>
+          <w:tcPr>
+            <w:tcW w:type="dxa" w:w="1234"/>
+          </w:tcPr>
+          <w:p>
+            <w:r>
+              <w:t>200000.00</w:t>
+            </w:r>
+          </w:p>
+        </w:tc>
+      </w:tr>
+      <w:tr>
+        <w:tc>
+          <w:tcPr>
+            <w:tcW w:type="dxa" w:w="1234"/>
+          </w:tcPr>
+          <w:p>
+            <w:r>
+              <w:t>5</w:t>
+            </w:r>
+          </w:p>
+        </w:tc>
+        <w:tc>
+          <w:tcPr>
+            <w:tcW w:type="dxa" w:w="1234"/>
+          </w:tcPr>
+          <w:p>
+            <w:r>
+              <w:t>Laptop dell</w:t>
+            </w:r>
+          </w:p>
+        </w:tc>
+        <w:tc>
+          <w:tcPr>
+            <w:tcW w:type="dxa" w:w="1234"/>
+          </w:tcPr>
+          <w:p>
+            <w:r/>
+          </w:p>
+        </w:tc>
+        <w:tc>
+          <w:tcPr>
+            <w:tcW w:type="dxa" w:w="1234"/>
+          </w:tcPr>
+          <w:p>
+            <w:r>
+              <w:t>Intel i7, 16GB RAM, 512GB SSD</w:t>
+            </w:r>
+          </w:p>
+        </w:tc>
+        <w:tc>
+          <w:tcPr>
+            <w:tcW w:type="dxa" w:w="1234"/>
+          </w:tcPr>
+          <w:p>
+            <w:r>
+              <w:t>Nos</w:t>
+            </w:r>
+          </w:p>
+        </w:tc>
+        <w:tc>
+          <w:tcPr>
+            <w:tcW w:type="dxa" w:w="1234"/>
+          </w:tcPr>
+          <w:p>
+            <w:r>
+              <w:t>20.00</w:t>
+            </w:r>
+          </w:p>
+        </w:tc>
+        <w:tc>
+          <w:tcPr>
+            <w:tcW w:type="dxa" w:w="1234"/>
+          </w:tcPr>
+          <w:p>
+            <w:r>
+              <w:t>20000.00</w:t>
+            </w:r>
+          </w:p>
+        </w:tc>
+      </w:tr>
+    </w:tbl>
+    <w:p>
+      <w:r>
+        <w:t>Total Estimated Value: 1879980.0000</w:t>
+      </w:r>
+    </w:p>
+    <w:p>
+      <w:pPr>
+        <w:pStyle w:val="Heading2"/>
+      </w:pPr>
+      <w:r>
+        <w:t>TECHNICAL SPECIFICATIONS</w:t>
+      </w:r>
+    </w:p>
+    <w:p>
+      <w:r>
+        <w:t>• wireless</w:t>
+      </w:r>
+    </w:p>
+    <w:p>
+      <w:r>
+        <w:t>• 5g, 8 gb ram, 128 gb storage</w:t>
+      </w:r>
+    </w:p>
+    <w:p>
+      <w:r>
+        <w:t>• fggg556666</w:t>
+      </w:r>
+    </w:p>
+    <w:p>
+      <w:r>
+        <w:t>• dff4555</w:t>
+      </w:r>
+    </w:p>
+    <w:p>
+      <w:r>
+        <w:t>• Intel i7, 16GB RAM, 512GB SSD</w:t>
       </w:r>
     </w:p>
     <w:sectPr>

</xml_diff>